<commit_message>
docs: arayüz ekran görüntüleri (portal 6 + operasyon konsolu 10) — rapor + README
- docs/assets/ui/: 18 ekran (portal 7, operasyon konsolu 10 + giriş)
- PROJE_RAPORU (pdf+docx): 10.3 Ekran Görüntüleri galerisi (16 ekran)
- README: portal + operasyon konsolu (10 ekran: dashboard, müşteri, ürün, sipariş, faturalama, ticket, monitoring, logs, alarm, incident)
</commit_message>
<xml_diff>
--- a/docs/PROJE_RAPORU.docx
+++ b/docs/PROJE_RAPORU.docx
@@ -312,7 +312,7 @@
             <w:pPr>
               <w:jc w:val="left"/>
             </w:pPr>
-            <w:hyperlink w:history="1" r:id="rIdcmotdgfu18yk9olyd0n9f">
+            <w:hyperlink w:history="1" r:id="rIdshgzila7mtjzjwazesehx">
               <w:r>
                 <w:rPr>
                   <w:rStyle w:val="Hyperlink"/>
@@ -401,7 +401,7 @@
             <w:pPr>
               <w:jc w:val="left"/>
             </w:pPr>
-            <w:hyperlink w:history="1" r:id="rIdm5onao7dirlnj71ms3set">
+            <w:hyperlink w:history="1" r:id="rId0avv4wetaxz-ktwklya1i">
               <w:r>
                 <w:rPr>
                   <w:rStyle w:val="Hyperlink"/>
@@ -490,7 +490,7 @@
             <w:pPr>
               <w:jc w:val="left"/>
             </w:pPr>
-            <w:hyperlink w:history="1" r:id="rIdetxkotcbjt0ckic91c3fw">
+            <w:hyperlink w:history="1" r:id="rIdfrbcgg1bs-2vi5sztmdjr">
               <w:r>
                 <w:rPr>
                   <w:rStyle w:val="Hyperlink"/>
@@ -579,7 +579,7 @@
             <w:pPr>
               <w:jc w:val="left"/>
             </w:pPr>
-            <w:hyperlink w:history="1" r:id="rIdaipmd7yuktcfp3guo9uom">
+            <w:hyperlink w:history="1" r:id="rId2y3ar-yl2dg0loboaurwb">
               <w:r>
                 <w:rPr>
                   <w:rStyle w:val="Hyperlink"/>
@@ -668,7 +668,7 @@
             <w:pPr>
               <w:jc w:val="left"/>
             </w:pPr>
-            <w:hyperlink w:history="1" r:id="rIdncc0jc0_eqgvw9nfzoxex">
+            <w:hyperlink w:history="1" r:id="rIdnupegwmcts9er8agdz6be">
               <w:r>
                 <w:rPr>
                   <w:rStyle w:val="Hyperlink"/>
@@ -757,7 +757,7 @@
             <w:pPr>
               <w:jc w:val="left"/>
             </w:pPr>
-            <w:hyperlink w:history="1" r:id="rId2uw82kalrl9cw48dwu8ww">
+            <w:hyperlink w:history="1" r:id="rIdxkxduxkmhiviagexsnrzo">
               <w:r>
                 <w:rPr>
                   <w:rStyle w:val="Hyperlink"/>
@@ -846,7 +846,7 @@
             <w:pPr>
               <w:jc w:val="left"/>
             </w:pPr>
-            <w:hyperlink w:history="1" r:id="rIdsprlr3tayjbcz386jrm13">
+            <w:hyperlink w:history="1" r:id="rIdguglq3hnjrdnnajps4g5m">
               <w:r>
                 <w:rPr>
                   <w:rStyle w:val="Hyperlink"/>
@@ -935,7 +935,7 @@
             <w:pPr>
               <w:jc w:val="left"/>
             </w:pPr>
-            <w:hyperlink w:history="1" r:id="rIdwbjeo_vyijpubbwhrbwrd">
+            <w:hyperlink w:history="1" r:id="rIde8ujm6eactfteuyrn5bsa">
               <w:r>
                 <w:rPr>
                   <w:rStyle w:val="Hyperlink"/>
@@ -1024,7 +1024,7 @@
             <w:pPr>
               <w:jc w:val="left"/>
             </w:pPr>
-            <w:hyperlink w:history="1" r:id="rIdyvnpyop_-0-7tfs16l_lp">
+            <w:hyperlink w:history="1" r:id="rIdm1gayogsu2yxdqtunw_km">
               <w:r>
                 <w:rPr>
                   <w:rStyle w:val="Hyperlink"/>
@@ -1113,7 +1113,7 @@
             <w:pPr>
               <w:jc w:val="left"/>
             </w:pPr>
-            <w:hyperlink w:history="1" r:id="rIdn7zww4osdhtu0jew1zbp0">
+            <w:hyperlink w:history="1" r:id="rIdyy7df83nkni7yrib8evvl">
               <w:r>
                 <w:rPr>
                   <w:rStyle w:val="Hyperlink"/>
@@ -1338,7 +1338,7 @@
             <w:pPr>
               <w:jc w:val="left"/>
             </w:pPr>
-            <w:hyperlink w:history="1" r:id="rIdupeimpro8yoj3fu-jtrmi">
+            <w:hyperlink w:history="1" r:id="rIdjaollqcgjskjnvljdhka-">
               <w:r>
                 <w:rPr>
                   <w:rStyle w:val="Hyperlink"/>
@@ -1427,7 +1427,7 @@
             <w:pPr>
               <w:jc w:val="left"/>
             </w:pPr>
-            <w:hyperlink w:history="1" r:id="rIdh6dpajj_na6e7t5udxib-">
+            <w:hyperlink w:history="1" r:id="rId-yykbnddibivkqs290hkn">
               <w:r>
                 <w:rPr>
                   <w:rStyle w:val="Hyperlink"/>
@@ -1516,7 +1516,7 @@
             <w:pPr>
               <w:jc w:val="left"/>
             </w:pPr>
-            <w:hyperlink w:history="1" r:id="rId48k3x51yo2uauazxmkxaz">
+            <w:hyperlink w:history="1" r:id="rIdowrwovlzlqalgtfzosduz">
               <w:r>
                 <w:rPr>
                   <w:rStyle w:val="Hyperlink"/>
@@ -1605,7 +1605,7 @@
             <w:pPr>
               <w:jc w:val="left"/>
             </w:pPr>
-            <w:hyperlink w:history="1" r:id="rIdu8b3lb6c-f0sinmujsi_z">
+            <w:hyperlink w:history="1" r:id="rId-rwccz6akv1as8pdc46_s">
               <w:r>
                 <w:rPr>
                   <w:rStyle w:val="Hyperlink"/>
@@ -1694,7 +1694,7 @@
             <w:pPr>
               <w:jc w:val="left"/>
             </w:pPr>
-            <w:hyperlink w:history="1" r:id="rIdtfvmum3emiucxm_uzcxwi">
+            <w:hyperlink w:history="1" r:id="rIdet9w14qs1pnmybbavsmid">
               <w:r>
                 <w:rPr>
                   <w:rStyle w:val="Hyperlink"/>
@@ -1783,7 +1783,7 @@
             <w:pPr>
               <w:jc w:val="left"/>
             </w:pPr>
-            <w:hyperlink w:history="1" r:id="rIdwpt-t2frpk8obzrisgwoj">
+            <w:hyperlink w:history="1" r:id="rIdsv6tofwsianpzxaatgikn">
               <w:r>
                 <w:rPr>
                   <w:rStyle w:val="Hyperlink"/>
@@ -1872,7 +1872,7 @@
             <w:pPr>
               <w:jc w:val="left"/>
             </w:pPr>
-            <w:hyperlink w:history="1" r:id="rId8updywvudelrgwnrljex-">
+            <w:hyperlink w:history="1" r:id="rIdk8nlmf48iybyhpl04hpbz">
               <w:r>
                 <w:rPr>
                   <w:rStyle w:val="Hyperlink"/>
@@ -1961,7 +1961,7 @@
             <w:pPr>
               <w:jc w:val="left"/>
             </w:pPr>
-            <w:hyperlink w:history="1" r:id="rIdgcvb8bey-bx6y04qafk75">
+            <w:hyperlink w:history="1" r:id="rIdu3lz6rc8zr-3gndf_tw7f">
               <w:r>
                 <w:rPr>
                   <w:rStyle w:val="Hyperlink"/>
@@ -2050,7 +2050,7 @@
             <w:pPr>
               <w:jc w:val="left"/>
             </w:pPr>
-            <w:hyperlink w:history="1" r:id="rIdp9rxkonq3llkb36ztkjoj">
+            <w:hyperlink w:history="1" r:id="rIdfy3fkyfhvicfnzjjtu_nt">
               <w:r>
                 <w:rPr>
                   <w:rStyle w:val="Hyperlink"/>
@@ -2398,7 +2398,7 @@
       <w:pPr>
         <w:jc w:val="center"/>
       </w:pPr>
-      <w:hyperlink w:history="1" r:id="rIdkwv69rmjepco2qm0png2z">
+      <w:hyperlink w:history="1" r:id="rIdegaohdzb19izrhf4mtrnm">
         <w:r>
           <w:rPr>
             <w:rStyle w:val="Hyperlink"/>
@@ -6674,6 +6674,1342 @@
     </w:p>
     <w:p>
       <w:pPr>
+        <w:pStyle w:val="Heading2"/>
+        <w:spacing w:after="100" w:before="220"/>
+      </w:pPr>
+      <w:r>
+        <w:rPr>
+          <w:b/>
+          <w:bCs/>
+          <w:color w:val="2D6CDF"/>
+          <w:sz w:val="24"/>
+          <w:szCs w:val="24"/>
+        </w:rPr>
+        <w:t xml:space="preserve">10.3 Ekran Görüntüleri</w:t>
+      </w:r>
+    </w:p>
+    <w:p>
+      <w:pPr>
+        <w:spacing w:after="120" w:line="276"/>
+      </w:pPr>
+      <w:r>
+        <w:rPr>
+          <w:color w:val="1B2430"/>
+          <w:sz w:val="21"/>
+          <w:szCs w:val="21"/>
+        </w:rPr>
+        <w:t xml:space="preserve">Aşağıdaki ekranlar gerçek arayüzden alınmıştır (gerçek HTML/CSS/JS, gerçekçi demo verisiyle). </w:t>
+      </w:r>
+      <w:r>
+        <w:rPr>
+          <w:color w:val="1B2430"/>
+          <w:sz w:val="21"/>
+          <w:szCs w:val="21"/>
+        </w:rPr>
+        <w:t xml:space="preserve">Tüm ekranların tam çözünürlüklü hâli repo’da </w:t>
+      </w:r>
+      <w:r>
+        <w:rPr>
+          <w:b/>
+          <w:bCs/>
+          <w:color w:val="1B2430"/>
+          <w:sz w:val="21"/>
+          <w:szCs w:val="21"/>
+        </w:rPr>
+        <w:t xml:space="preserve">docs/assets/ui/</w:t>
+      </w:r>
+      <w:r>
+        <w:rPr>
+          <w:color w:val="1B2430"/>
+          <w:sz w:val="21"/>
+          <w:szCs w:val="21"/>
+        </w:rPr>
+        <w:t xml:space="preserve"> altındadır.</w:t>
+      </w:r>
+    </w:p>
+    <w:tbl>
+      <w:tblPr>
+        <w:tblW w:type="dxa" w:w="9638"/>
+        <w:tblBorders>
+          <w:top w:val="none"/>
+          <w:left w:val="none"/>
+          <w:bottom w:val="none"/>
+          <w:right w:val="none"/>
+          <w:insideH w:val="single" w:color="auto" w:sz="4"/>
+          <w:insideV w:val="single" w:color="auto" w:sz="4"/>
+        </w:tblBorders>
+      </w:tblPr>
+      <w:tblGrid>
+        <w:gridCol w:w="4819"/>
+        <w:gridCol w:w="4819"/>
+      </w:tblGrid>
+      <w:tr>
+        <w:tc>
+          <w:tcPr>
+            <w:tcW w:type="dxa" w:w="4819"/>
+            <w:tcBorders>
+              <w:top w:val="none"/>
+              <w:left w:val="none"/>
+              <w:bottom w:val="none"/>
+              <w:right w:val="none"/>
+            </w:tcBorders>
+            <w:tcMar>
+              <w:top w:type="dxa" w:w="60"/>
+              <w:left w:type="dxa" w:w="80"/>
+              <w:bottom w:type="dxa" w:w="60"/>
+              <w:right w:type="dxa" w:w="80"/>
+            </w:tcMar>
+          </w:tcPr>
+          <w:p>
+            <w:pPr>
+              <w:spacing w:after="40"/>
+              <w:jc w:val="center"/>
+            </w:pPr>
+            <w:r>
+              <w:drawing>
+                <wp:inline distT="0" distB="0" distL="0" distR="0">
+                  <wp:extent cx="2857500" cy="1924050"/>
+                  <wp:effectExtent t="0" r="0" b="0" l="0"/>
+                  <wp:docPr id="1" name="" descr="" title=""/>
+                  <wp:cNvGraphicFramePr>
+                    <a:graphicFrameLocks xmlns:a="http://schemas.openxmlformats.org/drawingml/2006/main" noChangeAspect="1"/>
+                  </wp:cNvGraphicFramePr>
+                  <a:graphic xmlns:a="http://schemas.openxmlformats.org/drawingml/2006/main">
+                    <a:graphicData uri="http://schemas.openxmlformats.org/drawingml/2006/picture">
+                      <pic:pic xmlns:pic="http://schemas.openxmlformats.org/drawingml/2006/picture">
+                        <pic:nvPicPr>
+                          <pic:cNvPr id="0" name="" descr=""/>
+                          <pic:cNvPicPr>
+                            <a:picLocks noChangeAspect="1" noChangeArrowheads="1"/>
+                          </pic:cNvPicPr>
+                        </pic:nvPicPr>
+                        <pic:blipFill>
+                          <a:blip r:embed="rId12" cstate="none"/>
+                          <a:srcRect/>
+                          <a:stretch>
+                            <a:fillRect/>
+                          </a:stretch>
+                        </pic:blipFill>
+                        <pic:spPr bwMode="auto">
+                          <a:xfrm>
+                            <a:off x="0" y="0"/>
+                            <a:ext cx="2857500" cy="1924050"/>
+                          </a:xfrm>
+                          <a:prstGeom prst="rect">
+                            <a:avLst/>
+                          </a:prstGeom>
+                        </pic:spPr>
+                      </pic:pic>
+                    </a:graphicData>
+                  </a:graphic>
+                </wp:inline>
+              </w:drawing>
+            </w:r>
+          </w:p>
+          <w:p>
+            <w:pPr>
+              <w:jc w:val="center"/>
+            </w:pPr>
+            <w:r>
+              <w:rPr>
+                <w:i/>
+                <w:iCs/>
+                <w:color w:val="6B7683"/>
+                <w:sz w:val="15"/>
+                <w:szCs w:val="15"/>
+              </w:rPr>
+              <w:t xml:space="preserve">Giriş — müşteri/yönetici sekmeli; kimlik Keycloak (realm telco-crm)</w:t>
+            </w:r>
+          </w:p>
+        </w:tc>
+        <w:tc>
+          <w:tcPr>
+            <w:tcW w:type="dxa" w:w="4819"/>
+            <w:tcBorders>
+              <w:top w:val="none"/>
+              <w:left w:val="none"/>
+              <w:bottom w:val="none"/>
+              <w:right w:val="none"/>
+            </w:tcBorders>
+            <w:tcMar>
+              <w:top w:type="dxa" w:w="60"/>
+              <w:left w:type="dxa" w:w="80"/>
+              <w:bottom w:type="dxa" w:w="60"/>
+              <w:right w:type="dxa" w:w="80"/>
+            </w:tcMar>
+          </w:tcPr>
+          <w:p>
+            <w:pPr>
+              <w:spacing w:after="40"/>
+              <w:jc w:val="center"/>
+            </w:pPr>
+            <w:r>
+              <w:drawing>
+                <wp:inline distT="0" distB="0" distL="0" distR="0">
+                  <wp:extent cx="2857500" cy="2009775"/>
+                  <wp:effectExtent t="0" r="0" b="0" l="0"/>
+                  <wp:docPr id="1" name="" descr="" title=""/>
+                  <wp:cNvGraphicFramePr>
+                    <a:graphicFrameLocks xmlns:a="http://schemas.openxmlformats.org/drawingml/2006/main" noChangeAspect="1"/>
+                  </wp:cNvGraphicFramePr>
+                  <a:graphic xmlns:a="http://schemas.openxmlformats.org/drawingml/2006/main">
+                    <a:graphicData uri="http://schemas.openxmlformats.org/drawingml/2006/picture">
+                      <pic:pic xmlns:pic="http://schemas.openxmlformats.org/drawingml/2006/picture">
+                        <pic:nvPicPr>
+                          <pic:cNvPr id="0" name="" descr=""/>
+                          <pic:cNvPicPr>
+                            <a:picLocks noChangeAspect="1" noChangeArrowheads="1"/>
+                          </pic:cNvPicPr>
+                        </pic:nvPicPr>
+                        <pic:blipFill>
+                          <a:blip r:embed="rId13" cstate="none"/>
+                          <a:srcRect/>
+                          <a:stretch>
+                            <a:fillRect/>
+                          </a:stretch>
+                        </pic:blipFill>
+                        <pic:spPr bwMode="auto">
+                          <a:xfrm>
+                            <a:off x="0" y="0"/>
+                            <a:ext cx="2857500" cy="2009775"/>
+                          </a:xfrm>
+                          <a:prstGeom prst="rect">
+                            <a:avLst/>
+                          </a:prstGeom>
+                        </pic:spPr>
+                      </pic:pic>
+                    </a:graphicData>
+                  </a:graphic>
+                </wp:inline>
+              </w:drawing>
+            </w:r>
+          </w:p>
+          <w:p>
+            <w:pPr>
+              <w:jc w:val="center"/>
+            </w:pPr>
+            <w:r>
+              <w:rPr>
+                <w:i/>
+                <w:iCs/>
+                <w:color w:val="6B7683"/>
+                <w:sz w:val="15"/>
+                <w:szCs w:val="15"/>
+              </w:rPr>
+              <w:t xml:space="preserve">Müşteri portalı — Ana sayfa: canlı kota çubukları, tarife, fatura</w:t>
+            </w:r>
+          </w:p>
+        </w:tc>
+      </w:tr>
+      <w:tr>
+        <w:tc>
+          <w:tcPr>
+            <w:tcW w:type="dxa" w:w="4819"/>
+            <w:tcBorders>
+              <w:top w:val="none"/>
+              <w:left w:val="none"/>
+              <w:bottom w:val="none"/>
+              <w:right w:val="none"/>
+            </w:tcBorders>
+            <w:tcMar>
+              <w:top w:type="dxa" w:w="60"/>
+              <w:left w:type="dxa" w:w="80"/>
+              <w:bottom w:type="dxa" w:w="60"/>
+              <w:right w:type="dxa" w:w="80"/>
+            </w:tcMar>
+          </w:tcPr>
+          <w:p>
+            <w:pPr>
+              <w:spacing w:after="40"/>
+              <w:jc w:val="center"/>
+            </w:pPr>
+            <w:r>
+              <w:drawing>
+                <wp:inline distT="0" distB="0" distL="0" distR="0">
+                  <wp:extent cx="2857500" cy="2009775"/>
+                  <wp:effectExtent t="0" r="0" b="0" l="0"/>
+                  <wp:docPr id="1" name="" descr="" title=""/>
+                  <wp:cNvGraphicFramePr>
+                    <a:graphicFrameLocks xmlns:a="http://schemas.openxmlformats.org/drawingml/2006/main" noChangeAspect="1"/>
+                  </wp:cNvGraphicFramePr>
+                  <a:graphic xmlns:a="http://schemas.openxmlformats.org/drawingml/2006/main">
+                    <a:graphicData uri="http://schemas.openxmlformats.org/drawingml/2006/picture">
+                      <pic:pic xmlns:pic="http://schemas.openxmlformats.org/drawingml/2006/picture">
+                        <pic:nvPicPr>
+                          <pic:cNvPr id="0" name="" descr=""/>
+                          <pic:cNvPicPr>
+                            <a:picLocks noChangeAspect="1" noChangeArrowheads="1"/>
+                          </pic:cNvPicPr>
+                        </pic:nvPicPr>
+                        <pic:blipFill>
+                          <a:blip r:embed="rId14" cstate="none"/>
+                          <a:srcRect/>
+                          <a:stretch>
+                            <a:fillRect/>
+                          </a:stretch>
+                        </pic:blipFill>
+                        <pic:spPr bwMode="auto">
+                          <a:xfrm>
+                            <a:off x="0" y="0"/>
+                            <a:ext cx="2857500" cy="2009775"/>
+                          </a:xfrm>
+                          <a:prstGeom prst="rect">
+                            <a:avLst/>
+                          </a:prstGeom>
+                        </pic:spPr>
+                      </pic:pic>
+                    </a:graphicData>
+                  </a:graphic>
+                </wp:inline>
+              </w:drawing>
+            </w:r>
+          </w:p>
+          <w:p>
+            <w:pPr>
+              <w:jc w:val="center"/>
+            </w:pPr>
+            <w:r>
+              <w:rPr>
+                <w:i/>
+                <w:iCs/>
+                <w:color w:val="6B7683"/>
+                <w:sz w:val="15"/>
+                <w:szCs w:val="15"/>
+              </w:rPr>
+              <w:t xml:space="preserve">Paket Değiştir — gerçek katalog + avantaj paketi oluşturucu</w:t>
+            </w:r>
+          </w:p>
+        </w:tc>
+        <w:tc>
+          <w:tcPr>
+            <w:tcW w:type="dxa" w:w="4819"/>
+            <w:tcBorders>
+              <w:top w:val="none"/>
+              <w:left w:val="none"/>
+              <w:bottom w:val="none"/>
+              <w:right w:val="none"/>
+            </w:tcBorders>
+            <w:tcMar>
+              <w:top w:type="dxa" w:w="60"/>
+              <w:left w:type="dxa" w:w="80"/>
+              <w:bottom w:type="dxa" w:w="60"/>
+              <w:right w:type="dxa" w:w="80"/>
+            </w:tcMar>
+          </w:tcPr>
+          <w:p>
+            <w:pPr>
+              <w:spacing w:after="40"/>
+              <w:jc w:val="center"/>
+            </w:pPr>
+            <w:r>
+              <w:drawing>
+                <wp:inline distT="0" distB="0" distL="0" distR="0">
+                  <wp:extent cx="2857500" cy="2009775"/>
+                  <wp:effectExtent t="0" r="0" b="0" l="0"/>
+                  <wp:docPr id="1" name="" descr="" title=""/>
+                  <wp:cNvGraphicFramePr>
+                    <a:graphicFrameLocks xmlns:a="http://schemas.openxmlformats.org/drawingml/2006/main" noChangeAspect="1"/>
+                  </wp:cNvGraphicFramePr>
+                  <a:graphic xmlns:a="http://schemas.openxmlformats.org/drawingml/2006/main">
+                    <a:graphicData uri="http://schemas.openxmlformats.org/drawingml/2006/picture">
+                      <pic:pic xmlns:pic="http://schemas.openxmlformats.org/drawingml/2006/picture">
+                        <pic:nvPicPr>
+                          <pic:cNvPr id="0" name="" descr=""/>
+                          <pic:cNvPicPr>
+                            <a:picLocks noChangeAspect="1" noChangeArrowheads="1"/>
+                          </pic:cNvPicPr>
+                        </pic:nvPicPr>
+                        <pic:blipFill>
+                          <a:blip r:embed="rId15" cstate="none"/>
+                          <a:srcRect/>
+                          <a:stretch>
+                            <a:fillRect/>
+                          </a:stretch>
+                        </pic:blipFill>
+                        <pic:spPr bwMode="auto">
+                          <a:xfrm>
+                            <a:off x="0" y="0"/>
+                            <a:ext cx="2857500" cy="2009775"/>
+                          </a:xfrm>
+                          <a:prstGeom prst="rect">
+                            <a:avLst/>
+                          </a:prstGeom>
+                        </pic:spPr>
+                      </pic:pic>
+                    </a:graphicData>
+                  </a:graphic>
+                </wp:inline>
+              </w:drawing>
+            </w:r>
+          </w:p>
+          <w:p>
+            <w:pPr>
+              <w:jc w:val="center"/>
+            </w:pPr>
+            <w:r>
+              <w:rPr>
+                <w:i/>
+                <w:iCs/>
+                <w:color w:val="6B7683"/>
+                <w:sz w:val="15"/>
+                <w:szCs w:val="15"/>
+              </w:rPr>
+              <w:t xml:space="preserve">Kullanımım — CDR grafiği, uygulama dağılımı, kota uyarısı</w:t>
+            </w:r>
+          </w:p>
+        </w:tc>
+      </w:tr>
+      <w:tr>
+        <w:tc>
+          <w:tcPr>
+            <w:tcW w:type="dxa" w:w="4819"/>
+            <w:tcBorders>
+              <w:top w:val="none"/>
+              <w:left w:val="none"/>
+              <w:bottom w:val="none"/>
+              <w:right w:val="none"/>
+            </w:tcBorders>
+            <w:tcMar>
+              <w:top w:type="dxa" w:w="60"/>
+              <w:left w:type="dxa" w:w="80"/>
+              <w:bottom w:type="dxa" w:w="60"/>
+              <w:right w:type="dxa" w:w="80"/>
+            </w:tcMar>
+          </w:tcPr>
+          <w:p>
+            <w:pPr>
+              <w:spacing w:after="40"/>
+              <w:jc w:val="center"/>
+            </w:pPr>
+            <w:r>
+              <w:drawing>
+                <wp:inline distT="0" distB="0" distL="0" distR="0">
+                  <wp:extent cx="2857500" cy="2009775"/>
+                  <wp:effectExtent t="0" r="0" b="0" l="0"/>
+                  <wp:docPr id="1" name="" descr="" title=""/>
+                  <wp:cNvGraphicFramePr>
+                    <a:graphicFrameLocks xmlns:a="http://schemas.openxmlformats.org/drawingml/2006/main" noChangeAspect="1"/>
+                  </wp:cNvGraphicFramePr>
+                  <a:graphic xmlns:a="http://schemas.openxmlformats.org/drawingml/2006/main">
+                    <a:graphicData uri="http://schemas.openxmlformats.org/drawingml/2006/picture">
+                      <pic:pic xmlns:pic="http://schemas.openxmlformats.org/drawingml/2006/picture">
+                        <pic:nvPicPr>
+                          <pic:cNvPr id="0" name="" descr=""/>
+                          <pic:cNvPicPr>
+                            <a:picLocks noChangeAspect="1" noChangeArrowheads="1"/>
+                          </pic:cNvPicPr>
+                        </pic:nvPicPr>
+                        <pic:blipFill>
+                          <a:blip r:embed="rId16" cstate="none"/>
+                          <a:srcRect/>
+                          <a:stretch>
+                            <a:fillRect/>
+                          </a:stretch>
+                        </pic:blipFill>
+                        <pic:spPr bwMode="auto">
+                          <a:xfrm>
+                            <a:off x="0" y="0"/>
+                            <a:ext cx="2857500" cy="2009775"/>
+                          </a:xfrm>
+                          <a:prstGeom prst="rect">
+                            <a:avLst/>
+                          </a:prstGeom>
+                        </pic:spPr>
+                      </pic:pic>
+                    </a:graphicData>
+                  </a:graphic>
+                </wp:inline>
+              </w:drawing>
+            </w:r>
+          </w:p>
+          <w:p>
+            <w:pPr>
+              <w:jc w:val="center"/>
+            </w:pPr>
+            <w:r>
+              <w:rPr>
+                <w:i/>
+                <w:iCs/>
+                <w:color w:val="6B7683"/>
+                <w:sz w:val="15"/>
+                <w:szCs w:val="15"/>
+              </w:rPr>
+              <w:t xml:space="preserve">Faturalarım — aylık ödeme grafiği + PDF + ÖİV/KDV detay</w:t>
+            </w:r>
+          </w:p>
+        </w:tc>
+        <w:tc>
+          <w:tcPr>
+            <w:tcW w:type="dxa" w:w="4819"/>
+            <w:tcBorders>
+              <w:top w:val="none"/>
+              <w:left w:val="none"/>
+              <w:bottom w:val="none"/>
+              <w:right w:val="none"/>
+            </w:tcBorders>
+            <w:tcMar>
+              <w:top w:type="dxa" w:w="60"/>
+              <w:left w:type="dxa" w:w="80"/>
+              <w:bottom w:type="dxa" w:w="60"/>
+              <w:right w:type="dxa" w:w="80"/>
+            </w:tcMar>
+          </w:tcPr>
+          <w:p>
+            <w:pPr>
+              <w:spacing w:after="40"/>
+              <w:jc w:val="center"/>
+            </w:pPr>
+            <w:r>
+              <w:drawing>
+                <wp:inline distT="0" distB="0" distL="0" distR="0">
+                  <wp:extent cx="2857500" cy="2009775"/>
+                  <wp:effectExtent t="0" r="0" b="0" l="0"/>
+                  <wp:docPr id="1" name="" descr="" title=""/>
+                  <wp:cNvGraphicFramePr>
+                    <a:graphicFrameLocks xmlns:a="http://schemas.openxmlformats.org/drawingml/2006/main" noChangeAspect="1"/>
+                  </wp:cNvGraphicFramePr>
+                  <a:graphic xmlns:a="http://schemas.openxmlformats.org/drawingml/2006/main">
+                    <a:graphicData uri="http://schemas.openxmlformats.org/drawingml/2006/picture">
+                      <pic:pic xmlns:pic="http://schemas.openxmlformats.org/drawingml/2006/picture">
+                        <pic:nvPicPr>
+                          <pic:cNvPr id="0" name="" descr=""/>
+                          <pic:cNvPicPr>
+                            <a:picLocks noChangeAspect="1" noChangeArrowheads="1"/>
+                          </pic:cNvPicPr>
+                        </pic:nvPicPr>
+                        <pic:blipFill>
+                          <a:blip r:embed="rId17" cstate="none"/>
+                          <a:srcRect/>
+                          <a:stretch>
+                            <a:fillRect/>
+                          </a:stretch>
+                        </pic:blipFill>
+                        <pic:spPr bwMode="auto">
+                          <a:xfrm>
+                            <a:off x="0" y="0"/>
+                            <a:ext cx="2857500" cy="2009775"/>
+                          </a:xfrm>
+                          <a:prstGeom prst="rect">
+                            <a:avLst/>
+                          </a:prstGeom>
+                        </pic:spPr>
+                      </pic:pic>
+                    </a:graphicData>
+                  </a:graphic>
+                </wp:inline>
+              </w:drawing>
+            </w:r>
+          </w:p>
+          <w:p>
+            <w:pPr>
+              <w:jc w:val="center"/>
+            </w:pPr>
+            <w:r>
+              <w:rPr>
+                <w:i/>
+                <w:iCs/>
+                <w:color w:val="6B7683"/>
+                <w:sz w:val="15"/>
+                <w:szCs w:val="15"/>
+              </w:rPr>
+              <w:t xml:space="preserve">Taleplerim — kategori/öncelik → gerçek POST /tickets</w:t>
+            </w:r>
+          </w:p>
+        </w:tc>
+      </w:tr>
+      <w:tr>
+        <w:tc>
+          <w:tcPr>
+            <w:tcW w:type="dxa" w:w="4819"/>
+            <w:tcBorders>
+              <w:top w:val="none"/>
+              <w:left w:val="none"/>
+              <w:bottom w:val="none"/>
+              <w:right w:val="none"/>
+            </w:tcBorders>
+            <w:tcMar>
+              <w:top w:type="dxa" w:w="60"/>
+              <w:left w:type="dxa" w:w="80"/>
+              <w:bottom w:type="dxa" w:w="60"/>
+              <w:right w:type="dxa" w:w="80"/>
+            </w:tcMar>
+          </w:tcPr>
+          <w:p>
+            <w:pPr>
+              <w:spacing w:after="40"/>
+              <w:jc w:val="center"/>
+            </w:pPr>
+            <w:r>
+              <w:drawing>
+                <wp:inline distT="0" distB="0" distL="0" distR="0">
+                  <wp:extent cx="2857500" cy="1838325"/>
+                  <wp:effectExtent t="0" r="0" b="0" l="0"/>
+                  <wp:docPr id="1" name="" descr="" title=""/>
+                  <wp:cNvGraphicFramePr>
+                    <a:graphicFrameLocks xmlns:a="http://schemas.openxmlformats.org/drawingml/2006/main" noChangeAspect="1"/>
+                  </wp:cNvGraphicFramePr>
+                  <a:graphic xmlns:a="http://schemas.openxmlformats.org/drawingml/2006/main">
+                    <a:graphicData uri="http://schemas.openxmlformats.org/drawingml/2006/picture">
+                      <pic:pic xmlns:pic="http://schemas.openxmlformats.org/drawingml/2006/picture">
+                        <pic:nvPicPr>
+                          <pic:cNvPr id="0" name="" descr=""/>
+                          <pic:cNvPicPr>
+                            <a:picLocks noChangeAspect="1" noChangeArrowheads="1"/>
+                          </pic:cNvPicPr>
+                        </pic:nvPicPr>
+                        <pic:blipFill>
+                          <a:blip r:embed="rId18" cstate="none"/>
+                          <a:srcRect/>
+                          <a:stretch>
+                            <a:fillRect/>
+                          </a:stretch>
+                        </pic:blipFill>
+                        <pic:spPr bwMode="auto">
+                          <a:xfrm>
+                            <a:off x="0" y="0"/>
+                            <a:ext cx="2857500" cy="1838325"/>
+                          </a:xfrm>
+                          <a:prstGeom prst="rect">
+                            <a:avLst/>
+                          </a:prstGeom>
+                        </pic:spPr>
+                      </pic:pic>
+                    </a:graphicData>
+                  </a:graphic>
+                </wp:inline>
+              </w:drawing>
+            </w:r>
+          </w:p>
+          <w:p>
+            <w:pPr>
+              <w:jc w:val="center"/>
+            </w:pPr>
+            <w:r>
+              <w:rPr>
+                <w:i/>
+                <w:iCs/>
+                <w:color w:val="6B7683"/>
+                <w:sz w:val="15"/>
+                <w:szCs w:val="15"/>
+              </w:rPr>
+              <w:t xml:space="preserve">Operasyon konsolu — Dashboard (canlı KPI + servis durumu)</w:t>
+            </w:r>
+          </w:p>
+        </w:tc>
+        <w:tc>
+          <w:tcPr>
+            <w:tcW w:type="dxa" w:w="4819"/>
+            <w:tcBorders>
+              <w:top w:val="none"/>
+              <w:left w:val="none"/>
+              <w:bottom w:val="none"/>
+              <w:right w:val="none"/>
+            </w:tcBorders>
+            <w:tcMar>
+              <w:top w:type="dxa" w:w="60"/>
+              <w:left w:type="dxa" w:w="80"/>
+              <w:bottom w:type="dxa" w:w="60"/>
+              <w:right w:type="dxa" w:w="80"/>
+            </w:tcMar>
+          </w:tcPr>
+          <w:p>
+            <w:pPr>
+              <w:spacing w:after="40"/>
+              <w:jc w:val="center"/>
+            </w:pPr>
+            <w:r>
+              <w:drawing>
+                <wp:inline distT="0" distB="0" distL="0" distR="0">
+                  <wp:extent cx="2857500" cy="1838325"/>
+                  <wp:effectExtent t="0" r="0" b="0" l="0"/>
+                  <wp:docPr id="1" name="" descr="" title=""/>
+                  <wp:cNvGraphicFramePr>
+                    <a:graphicFrameLocks xmlns:a="http://schemas.openxmlformats.org/drawingml/2006/main" noChangeAspect="1"/>
+                  </wp:cNvGraphicFramePr>
+                  <a:graphic xmlns:a="http://schemas.openxmlformats.org/drawingml/2006/main">
+                    <a:graphicData uri="http://schemas.openxmlformats.org/drawingml/2006/picture">
+                      <pic:pic xmlns:pic="http://schemas.openxmlformats.org/drawingml/2006/picture">
+                        <pic:nvPicPr>
+                          <pic:cNvPr id="0" name="" descr=""/>
+                          <pic:cNvPicPr>
+                            <a:picLocks noChangeAspect="1" noChangeArrowheads="1"/>
+                          </pic:cNvPicPr>
+                        </pic:nvPicPr>
+                        <pic:blipFill>
+                          <a:blip r:embed="rId19" cstate="none"/>
+                          <a:srcRect/>
+                          <a:stretch>
+                            <a:fillRect/>
+                          </a:stretch>
+                        </pic:blipFill>
+                        <pic:spPr bwMode="auto">
+                          <a:xfrm>
+                            <a:off x="0" y="0"/>
+                            <a:ext cx="2857500" cy="1838325"/>
+                          </a:xfrm>
+                          <a:prstGeom prst="rect">
+                            <a:avLst/>
+                          </a:prstGeom>
+                        </pic:spPr>
+                      </pic:pic>
+                    </a:graphicData>
+                  </a:graphic>
+                </wp:inline>
+              </w:drawing>
+            </w:r>
+          </w:p>
+          <w:p>
+            <w:pPr>
+              <w:jc w:val="center"/>
+            </w:pPr>
+            <w:r>
+              <w:rPr>
+                <w:i/>
+                <w:iCs/>
+                <w:color w:val="6B7683"/>
+                <w:sz w:val="15"/>
+                <w:szCs w:val="15"/>
+              </w:rPr>
+              <w:t xml:space="preserve">Müşteriler — gerçek müşteri listesi + KYC/durum</w:t>
+            </w:r>
+          </w:p>
+        </w:tc>
+      </w:tr>
+      <w:tr>
+        <w:tc>
+          <w:tcPr>
+            <w:tcW w:type="dxa" w:w="4819"/>
+            <w:tcBorders>
+              <w:top w:val="none"/>
+              <w:left w:val="none"/>
+              <w:bottom w:val="none"/>
+              <w:right w:val="none"/>
+            </w:tcBorders>
+            <w:tcMar>
+              <w:top w:type="dxa" w:w="60"/>
+              <w:left w:type="dxa" w:w="80"/>
+              <w:bottom w:type="dxa" w:w="60"/>
+              <w:right w:type="dxa" w:w="80"/>
+            </w:tcMar>
+          </w:tcPr>
+          <w:p>
+            <w:pPr>
+              <w:spacing w:after="40"/>
+              <w:jc w:val="center"/>
+            </w:pPr>
+            <w:r>
+              <w:drawing>
+                <wp:inline distT="0" distB="0" distL="0" distR="0">
+                  <wp:extent cx="2857500" cy="1838325"/>
+                  <wp:effectExtent t="0" r="0" b="0" l="0"/>
+                  <wp:docPr id="1" name="" descr="" title=""/>
+                  <wp:cNvGraphicFramePr>
+                    <a:graphicFrameLocks xmlns:a="http://schemas.openxmlformats.org/drawingml/2006/main" noChangeAspect="1"/>
+                  </wp:cNvGraphicFramePr>
+                  <a:graphic xmlns:a="http://schemas.openxmlformats.org/drawingml/2006/main">
+                    <a:graphicData uri="http://schemas.openxmlformats.org/drawingml/2006/picture">
+                      <pic:pic xmlns:pic="http://schemas.openxmlformats.org/drawingml/2006/picture">
+                        <pic:nvPicPr>
+                          <pic:cNvPr id="0" name="" descr=""/>
+                          <pic:cNvPicPr>
+                            <a:picLocks noChangeAspect="1" noChangeArrowheads="1"/>
+                          </pic:cNvPicPr>
+                        </pic:nvPicPr>
+                        <pic:blipFill>
+                          <a:blip r:embed="rId20" cstate="none"/>
+                          <a:srcRect/>
+                          <a:stretch>
+                            <a:fillRect/>
+                          </a:stretch>
+                        </pic:blipFill>
+                        <pic:spPr bwMode="auto">
+                          <a:xfrm>
+                            <a:off x="0" y="0"/>
+                            <a:ext cx="2857500" cy="1838325"/>
+                          </a:xfrm>
+                          <a:prstGeom prst="rect">
+                            <a:avLst/>
+                          </a:prstGeom>
+                        </pic:spPr>
+                      </pic:pic>
+                    </a:graphicData>
+                  </a:graphic>
+                </wp:inline>
+              </w:drawing>
+            </w:r>
+          </w:p>
+          <w:p>
+            <w:pPr>
+              <w:jc w:val="center"/>
+            </w:pPr>
+            <w:r>
+              <w:rPr>
+                <w:i/>
+                <w:iCs/>
+                <w:color w:val="6B7683"/>
+                <w:sz w:val="15"/>
+                <w:szCs w:val="15"/>
+              </w:rPr>
+              <w:t xml:space="preserve">Ürünler — tarife kataloğu + tip/segment/versiyon</w:t>
+            </w:r>
+          </w:p>
+        </w:tc>
+        <w:tc>
+          <w:tcPr>
+            <w:tcW w:type="dxa" w:w="4819"/>
+            <w:tcBorders>
+              <w:top w:val="none"/>
+              <w:left w:val="none"/>
+              <w:bottom w:val="none"/>
+              <w:right w:val="none"/>
+            </w:tcBorders>
+            <w:tcMar>
+              <w:top w:type="dxa" w:w="60"/>
+              <w:left w:type="dxa" w:w="80"/>
+              <w:bottom w:type="dxa" w:w="60"/>
+              <w:right w:type="dxa" w:w="80"/>
+            </w:tcMar>
+          </w:tcPr>
+          <w:p>
+            <w:pPr>
+              <w:spacing w:after="40"/>
+              <w:jc w:val="center"/>
+            </w:pPr>
+            <w:r>
+              <w:drawing>
+                <wp:inline distT="0" distB="0" distL="0" distR="0">
+                  <wp:extent cx="2857500" cy="1838325"/>
+                  <wp:effectExtent t="0" r="0" b="0" l="0"/>
+                  <wp:docPr id="1" name="" descr="" title=""/>
+                  <wp:cNvGraphicFramePr>
+                    <a:graphicFrameLocks xmlns:a="http://schemas.openxmlformats.org/drawingml/2006/main" noChangeAspect="1"/>
+                  </wp:cNvGraphicFramePr>
+                  <a:graphic xmlns:a="http://schemas.openxmlformats.org/drawingml/2006/main">
+                    <a:graphicData uri="http://schemas.openxmlformats.org/drawingml/2006/picture">
+                      <pic:pic xmlns:pic="http://schemas.openxmlformats.org/drawingml/2006/picture">
+                        <pic:nvPicPr>
+                          <pic:cNvPr id="0" name="" descr=""/>
+                          <pic:cNvPicPr>
+                            <a:picLocks noChangeAspect="1" noChangeArrowheads="1"/>
+                          </pic:cNvPicPr>
+                        </pic:nvPicPr>
+                        <pic:blipFill>
+                          <a:blip r:embed="rId21" cstate="none"/>
+                          <a:srcRect/>
+                          <a:stretch>
+                            <a:fillRect/>
+                          </a:stretch>
+                        </pic:blipFill>
+                        <pic:spPr bwMode="auto">
+                          <a:xfrm>
+                            <a:off x="0" y="0"/>
+                            <a:ext cx="2857500" cy="1838325"/>
+                          </a:xfrm>
+                          <a:prstGeom prst="rect">
+                            <a:avLst/>
+                          </a:prstGeom>
+                        </pic:spPr>
+                      </pic:pic>
+                    </a:graphicData>
+                  </a:graphic>
+                </wp:inline>
+              </w:drawing>
+            </w:r>
+          </w:p>
+          <w:p>
+            <w:pPr>
+              <w:jc w:val="center"/>
+            </w:pPr>
+            <w:r>
+              <w:rPr>
+                <w:i/>
+                <w:iCs/>
+                <w:color w:val="6B7683"/>
+                <w:sz w:val="15"/>
+                <w:szCs w:val="15"/>
+              </w:rPr>
+              <w:t xml:space="preserve">Siparişler — portal satın almaları (canlı)</w:t>
+            </w:r>
+          </w:p>
+        </w:tc>
+      </w:tr>
+      <w:tr>
+        <w:tc>
+          <w:tcPr>
+            <w:tcW w:type="dxa" w:w="4819"/>
+            <w:tcBorders>
+              <w:top w:val="none"/>
+              <w:left w:val="none"/>
+              <w:bottom w:val="none"/>
+              <w:right w:val="none"/>
+            </w:tcBorders>
+            <w:tcMar>
+              <w:top w:type="dxa" w:w="60"/>
+              <w:left w:type="dxa" w:w="80"/>
+              <w:bottom w:type="dxa" w:w="60"/>
+              <w:right w:type="dxa" w:w="80"/>
+            </w:tcMar>
+          </w:tcPr>
+          <w:p>
+            <w:pPr>
+              <w:spacing w:after="40"/>
+              <w:jc w:val="center"/>
+            </w:pPr>
+            <w:r>
+              <w:drawing>
+                <wp:inline distT="0" distB="0" distL="0" distR="0">
+                  <wp:extent cx="2857500" cy="1838325"/>
+                  <wp:effectExtent t="0" r="0" b="0" l="0"/>
+                  <wp:docPr id="1" name="" descr="" title=""/>
+                  <wp:cNvGraphicFramePr>
+                    <a:graphicFrameLocks xmlns:a="http://schemas.openxmlformats.org/drawingml/2006/main" noChangeAspect="1"/>
+                  </wp:cNvGraphicFramePr>
+                  <a:graphic xmlns:a="http://schemas.openxmlformats.org/drawingml/2006/main">
+                    <a:graphicData uri="http://schemas.openxmlformats.org/drawingml/2006/picture">
+                      <pic:pic xmlns:pic="http://schemas.openxmlformats.org/drawingml/2006/picture">
+                        <pic:nvPicPr>
+                          <pic:cNvPr id="0" name="" descr=""/>
+                          <pic:cNvPicPr>
+                            <a:picLocks noChangeAspect="1" noChangeArrowheads="1"/>
+                          </pic:cNvPicPr>
+                        </pic:nvPicPr>
+                        <pic:blipFill>
+                          <a:blip r:embed="rId22" cstate="none"/>
+                          <a:srcRect/>
+                          <a:stretch>
+                            <a:fillRect/>
+                          </a:stretch>
+                        </pic:blipFill>
+                        <pic:spPr bwMode="auto">
+                          <a:xfrm>
+                            <a:off x="0" y="0"/>
+                            <a:ext cx="2857500" cy="1838325"/>
+                          </a:xfrm>
+                          <a:prstGeom prst="rect">
+                            <a:avLst/>
+                          </a:prstGeom>
+                        </pic:spPr>
+                      </pic:pic>
+                    </a:graphicData>
+                  </a:graphic>
+                </wp:inline>
+              </w:drawing>
+            </w:r>
+          </w:p>
+          <w:p>
+            <w:pPr>
+              <w:jc w:val="center"/>
+            </w:pPr>
+            <w:r>
+              <w:rPr>
+                <w:i/>
+                <w:iCs/>
+                <w:color w:val="6B7683"/>
+                <w:sz w:val="15"/>
+                <w:szCs w:val="15"/>
+              </w:rPr>
+              <w:t xml:space="preserve">Faturalama — bill-run + tüm müşteri faturaları</w:t>
+            </w:r>
+          </w:p>
+        </w:tc>
+        <w:tc>
+          <w:tcPr>
+            <w:tcW w:type="dxa" w:w="4819"/>
+            <w:tcBorders>
+              <w:top w:val="none"/>
+              <w:left w:val="none"/>
+              <w:bottom w:val="none"/>
+              <w:right w:val="none"/>
+            </w:tcBorders>
+            <w:tcMar>
+              <w:top w:type="dxa" w:w="60"/>
+              <w:left w:type="dxa" w:w="80"/>
+              <w:bottom w:type="dxa" w:w="60"/>
+              <w:right w:type="dxa" w:w="80"/>
+            </w:tcMar>
+          </w:tcPr>
+          <w:p>
+            <w:pPr>
+              <w:spacing w:after="40"/>
+              <w:jc w:val="center"/>
+            </w:pPr>
+            <w:r>
+              <w:drawing>
+                <wp:inline distT="0" distB="0" distL="0" distR="0">
+                  <wp:extent cx="2857500" cy="1838325"/>
+                  <wp:effectExtent t="0" r="0" b="0" l="0"/>
+                  <wp:docPr id="1" name="" descr="" title=""/>
+                  <wp:cNvGraphicFramePr>
+                    <a:graphicFrameLocks xmlns:a="http://schemas.openxmlformats.org/drawingml/2006/main" noChangeAspect="1"/>
+                  </wp:cNvGraphicFramePr>
+                  <a:graphic xmlns:a="http://schemas.openxmlformats.org/drawingml/2006/main">
+                    <a:graphicData uri="http://schemas.openxmlformats.org/drawingml/2006/picture">
+                      <pic:pic xmlns:pic="http://schemas.openxmlformats.org/drawingml/2006/picture">
+                        <pic:nvPicPr>
+                          <pic:cNvPr id="0" name="" descr=""/>
+                          <pic:cNvPicPr>
+                            <a:picLocks noChangeAspect="1" noChangeArrowheads="1"/>
+                          </pic:cNvPicPr>
+                        </pic:nvPicPr>
+                        <pic:blipFill>
+                          <a:blip r:embed="rId23" cstate="none"/>
+                          <a:srcRect/>
+                          <a:stretch>
+                            <a:fillRect/>
+                          </a:stretch>
+                        </pic:blipFill>
+                        <pic:spPr bwMode="auto">
+                          <a:xfrm>
+                            <a:off x="0" y="0"/>
+                            <a:ext cx="2857500" cy="1838325"/>
+                          </a:xfrm>
+                          <a:prstGeom prst="rect">
+                            <a:avLst/>
+                          </a:prstGeom>
+                        </pic:spPr>
+                      </pic:pic>
+                    </a:graphicData>
+                  </a:graphic>
+                </wp:inline>
+              </w:drawing>
+            </w:r>
+          </w:p>
+          <w:p>
+            <w:pPr>
+              <w:jc w:val="center"/>
+            </w:pPr>
+            <w:r>
+              <w:rPr>
+                <w:i/>
+                <w:iCs/>
+                <w:color w:val="6B7683"/>
+                <w:sz w:val="15"/>
+                <w:szCs w:val="15"/>
+              </w:rPr>
+              <w:t xml:space="preserve">Ticket Center — tüm talepler + otomatik ekip atama</w:t>
+            </w:r>
+          </w:p>
+        </w:tc>
+      </w:tr>
+      <w:tr>
+        <w:tc>
+          <w:tcPr>
+            <w:tcW w:type="dxa" w:w="4819"/>
+            <w:tcBorders>
+              <w:top w:val="none"/>
+              <w:left w:val="none"/>
+              <w:bottom w:val="none"/>
+              <w:right w:val="none"/>
+            </w:tcBorders>
+            <w:tcMar>
+              <w:top w:type="dxa" w:w="60"/>
+              <w:left w:type="dxa" w:w="80"/>
+              <w:bottom w:type="dxa" w:w="60"/>
+              <w:right w:type="dxa" w:w="80"/>
+            </w:tcMar>
+          </w:tcPr>
+          <w:p>
+            <w:pPr>
+              <w:spacing w:after="40"/>
+              <w:jc w:val="center"/>
+            </w:pPr>
+            <w:r>
+              <w:drawing>
+                <wp:inline distT="0" distB="0" distL="0" distR="0">
+                  <wp:extent cx="2857500" cy="1838325"/>
+                  <wp:effectExtent t="0" r="0" b="0" l="0"/>
+                  <wp:docPr id="1" name="" descr="" title=""/>
+                  <wp:cNvGraphicFramePr>
+                    <a:graphicFrameLocks xmlns:a="http://schemas.openxmlformats.org/drawingml/2006/main" noChangeAspect="1"/>
+                  </wp:cNvGraphicFramePr>
+                  <a:graphic xmlns:a="http://schemas.openxmlformats.org/drawingml/2006/main">
+                    <a:graphicData uri="http://schemas.openxmlformats.org/drawingml/2006/picture">
+                      <pic:pic xmlns:pic="http://schemas.openxmlformats.org/drawingml/2006/picture">
+                        <pic:nvPicPr>
+                          <pic:cNvPr id="0" name="" descr=""/>
+                          <pic:cNvPicPr>
+                            <a:picLocks noChangeAspect="1" noChangeArrowheads="1"/>
+                          </pic:cNvPicPr>
+                        </pic:nvPicPr>
+                        <pic:blipFill>
+                          <a:blip r:embed="rId24" cstate="none"/>
+                          <a:srcRect/>
+                          <a:stretch>
+                            <a:fillRect/>
+                          </a:stretch>
+                        </pic:blipFill>
+                        <pic:spPr bwMode="auto">
+                          <a:xfrm>
+                            <a:off x="0" y="0"/>
+                            <a:ext cx="2857500" cy="1838325"/>
+                          </a:xfrm>
+                          <a:prstGeom prst="rect">
+                            <a:avLst/>
+                          </a:prstGeom>
+                        </pic:spPr>
+                      </pic:pic>
+                    </a:graphicData>
+                  </a:graphic>
+                </wp:inline>
+              </w:drawing>
+            </w:r>
+          </w:p>
+          <w:p>
+            <w:pPr>
+              <w:jc w:val="center"/>
+            </w:pPr>
+            <w:r>
+              <w:rPr>
+                <w:i/>
+                <w:iCs/>
+                <w:color w:val="6B7683"/>
+                <w:sz w:val="15"/>
+                <w:szCs w:val="15"/>
+              </w:rPr>
+              <w:t xml:space="preserve">Monitoring — gerçek servis sağlığı + pod/CPU</w:t>
+            </w:r>
+          </w:p>
+        </w:tc>
+        <w:tc>
+          <w:tcPr>
+            <w:tcW w:type="dxa" w:w="4819"/>
+            <w:tcBorders>
+              <w:top w:val="none"/>
+              <w:left w:val="none"/>
+              <w:bottom w:val="none"/>
+              <w:right w:val="none"/>
+            </w:tcBorders>
+            <w:tcMar>
+              <w:top w:type="dxa" w:w="60"/>
+              <w:left w:type="dxa" w:w="80"/>
+              <w:bottom w:type="dxa" w:w="60"/>
+              <w:right w:type="dxa" w:w="80"/>
+            </w:tcMar>
+          </w:tcPr>
+          <w:p>
+            <w:pPr>
+              <w:spacing w:after="40"/>
+              <w:jc w:val="center"/>
+            </w:pPr>
+            <w:r>
+              <w:drawing>
+                <wp:inline distT="0" distB="0" distL="0" distR="0">
+                  <wp:extent cx="2857500" cy="1838325"/>
+                  <wp:effectExtent t="0" r="0" b="0" l="0"/>
+                  <wp:docPr id="1" name="" descr="" title=""/>
+                  <wp:cNvGraphicFramePr>
+                    <a:graphicFrameLocks xmlns:a="http://schemas.openxmlformats.org/drawingml/2006/main" noChangeAspect="1"/>
+                  </wp:cNvGraphicFramePr>
+                  <a:graphic xmlns:a="http://schemas.openxmlformats.org/drawingml/2006/main">
+                    <a:graphicData uri="http://schemas.openxmlformats.org/drawingml/2006/picture">
+                      <pic:pic xmlns:pic="http://schemas.openxmlformats.org/drawingml/2006/picture">
+                        <pic:nvPicPr>
+                          <pic:cNvPr id="0" name="" descr=""/>
+                          <pic:cNvPicPr>
+                            <a:picLocks noChangeAspect="1" noChangeArrowheads="1"/>
+                          </pic:cNvPicPr>
+                        </pic:nvPicPr>
+                        <pic:blipFill>
+                          <a:blip r:embed="rId25" cstate="none"/>
+                          <a:srcRect/>
+                          <a:stretch>
+                            <a:fillRect/>
+                          </a:stretch>
+                        </pic:blipFill>
+                        <pic:spPr bwMode="auto">
+                          <a:xfrm>
+                            <a:off x="0" y="0"/>
+                            <a:ext cx="2857500" cy="1838325"/>
+                          </a:xfrm>
+                          <a:prstGeom prst="rect">
+                            <a:avLst/>
+                          </a:prstGeom>
+                        </pic:spPr>
+                      </pic:pic>
+                    </a:graphicData>
+                  </a:graphic>
+                </wp:inline>
+              </w:drawing>
+            </w:r>
+          </w:p>
+          <w:p>
+            <w:pPr>
+              <w:jc w:val="center"/>
+            </w:pPr>
+            <w:r>
+              <w:rPr>
+                <w:i/>
+                <w:iCs/>
+                <w:color w:val="6B7683"/>
+                <w:sz w:val="15"/>
+                <w:szCs w:val="15"/>
+              </w:rPr>
+              <w:t xml:space="preserve">Logs — canlı log akışı (servis sağlığı + aktivite)</w:t>
+            </w:r>
+          </w:p>
+        </w:tc>
+      </w:tr>
+      <w:tr>
+        <w:tc>
+          <w:tcPr>
+            <w:tcW w:type="dxa" w:w="4819"/>
+            <w:tcBorders>
+              <w:top w:val="none"/>
+              <w:left w:val="none"/>
+              <w:bottom w:val="none"/>
+              <w:right w:val="none"/>
+            </w:tcBorders>
+            <w:tcMar>
+              <w:top w:type="dxa" w:w="60"/>
+              <w:left w:type="dxa" w:w="80"/>
+              <w:bottom w:type="dxa" w:w="60"/>
+              <w:right w:type="dxa" w:w="80"/>
+            </w:tcMar>
+          </w:tcPr>
+          <w:p>
+            <w:pPr>
+              <w:spacing w:after="40"/>
+              <w:jc w:val="center"/>
+            </w:pPr>
+            <w:r>
+              <w:drawing>
+                <wp:inline distT="0" distB="0" distL="0" distR="0">
+                  <wp:extent cx="2857500" cy="1838325"/>
+                  <wp:effectExtent t="0" r="0" b="0" l="0"/>
+                  <wp:docPr id="1" name="" descr="" title=""/>
+                  <wp:cNvGraphicFramePr>
+                    <a:graphicFrameLocks xmlns:a="http://schemas.openxmlformats.org/drawingml/2006/main" noChangeAspect="1"/>
+                  </wp:cNvGraphicFramePr>
+                  <a:graphic xmlns:a="http://schemas.openxmlformats.org/drawingml/2006/main">
+                    <a:graphicData uri="http://schemas.openxmlformats.org/drawingml/2006/picture">
+                      <pic:pic xmlns:pic="http://schemas.openxmlformats.org/drawingml/2006/picture">
+                        <pic:nvPicPr>
+                          <pic:cNvPr id="0" name="" descr=""/>
+                          <pic:cNvPicPr>
+                            <a:picLocks noChangeAspect="1" noChangeArrowheads="1"/>
+                          </pic:cNvPicPr>
+                        </pic:nvPicPr>
+                        <pic:blipFill>
+                          <a:blip r:embed="rId26" cstate="none"/>
+                          <a:srcRect/>
+                          <a:stretch>
+                            <a:fillRect/>
+                          </a:stretch>
+                        </pic:blipFill>
+                        <pic:spPr bwMode="auto">
+                          <a:xfrm>
+                            <a:off x="0" y="0"/>
+                            <a:ext cx="2857500" cy="1838325"/>
+                          </a:xfrm>
+                          <a:prstGeom prst="rect">
+                            <a:avLst/>
+                          </a:prstGeom>
+                        </pic:spPr>
+                      </pic:pic>
+                    </a:graphicData>
+                  </a:graphic>
+                </wp:inline>
+              </w:drawing>
+            </w:r>
+          </w:p>
+          <w:p>
+            <w:pPr>
+              <w:jc w:val="center"/>
+            </w:pPr>
+            <w:r>
+              <w:rPr>
+                <w:i/>
+                <w:iCs/>
+                <w:color w:val="6B7683"/>
+                <w:sz w:val="15"/>
+                <w:szCs w:val="15"/>
+              </w:rPr>
+              <w:t xml:space="preserve">Alarm Merkezi — gerçek DOWN/degraded alarmları</w:t>
+            </w:r>
+          </w:p>
+        </w:tc>
+        <w:tc>
+          <w:tcPr>
+            <w:tcW w:type="dxa" w:w="4819"/>
+            <w:tcBorders>
+              <w:top w:val="none"/>
+              <w:left w:val="none"/>
+              <w:bottom w:val="none"/>
+              <w:right w:val="none"/>
+            </w:tcBorders>
+            <w:tcMar>
+              <w:top w:type="dxa" w:w="60"/>
+              <w:left w:type="dxa" w:w="80"/>
+              <w:bottom w:type="dxa" w:w="60"/>
+              <w:right w:type="dxa" w:w="80"/>
+            </w:tcMar>
+          </w:tcPr>
+          <w:p>
+            <w:pPr>
+              <w:spacing w:after="40"/>
+              <w:jc w:val="center"/>
+            </w:pPr>
+            <w:r>
+              <w:drawing>
+                <wp:inline distT="0" distB="0" distL="0" distR="0">
+                  <wp:extent cx="2857500" cy="1838325"/>
+                  <wp:effectExtent t="0" r="0" b="0" l="0"/>
+                  <wp:docPr id="1" name="" descr="" title=""/>
+                  <wp:cNvGraphicFramePr>
+                    <a:graphicFrameLocks xmlns:a="http://schemas.openxmlformats.org/drawingml/2006/main" noChangeAspect="1"/>
+                  </wp:cNvGraphicFramePr>
+                  <a:graphic xmlns:a="http://schemas.openxmlformats.org/drawingml/2006/main">
+                    <a:graphicData uri="http://schemas.openxmlformats.org/drawingml/2006/picture">
+                      <pic:pic xmlns:pic="http://schemas.openxmlformats.org/drawingml/2006/picture">
+                        <pic:nvPicPr>
+                          <pic:cNvPr id="0" name="" descr=""/>
+                          <pic:cNvPicPr>
+                            <a:picLocks noChangeAspect="1" noChangeArrowheads="1"/>
+                          </pic:cNvPicPr>
+                        </pic:nvPicPr>
+                        <pic:blipFill>
+                          <a:blip r:embed="rId27" cstate="none"/>
+                          <a:srcRect/>
+                          <a:stretch>
+                            <a:fillRect/>
+                          </a:stretch>
+                        </pic:blipFill>
+                        <pic:spPr bwMode="auto">
+                          <a:xfrm>
+                            <a:off x="0" y="0"/>
+                            <a:ext cx="2857500" cy="1838325"/>
+                          </a:xfrm>
+                          <a:prstGeom prst="rect">
+                            <a:avLst/>
+                          </a:prstGeom>
+                        </pic:spPr>
+                      </pic:pic>
+                    </a:graphicData>
+                  </a:graphic>
+                </wp:inline>
+              </w:drawing>
+            </w:r>
+          </w:p>
+          <w:p>
+            <w:pPr>
+              <w:jc w:val="center"/>
+            </w:pPr>
+            <w:r>
+              <w:rPr>
+                <w:i/>
+                <w:iCs/>
+                <w:color w:val="6B7683"/>
+                <w:sz w:val="15"/>
+                <w:szCs w:val="15"/>
+              </w:rPr>
+              <w:t xml:space="preserve">Incident — servis DOWN olunca otomatik açılır/çözülür</w:t>
+            </w:r>
+          </w:p>
+        </w:tc>
+      </w:tr>
+    </w:tbl>
+    <w:p>
+      <w:pPr>
         <w:pStyle w:val="Heading1"/>
         <w:spacing w:after="140" w:before="320"/>
       </w:pPr>
@@ -7109,7 +8445,7 @@
                     </pic:cNvPicPr>
                   </pic:nvPicPr>
                   <pic:blipFill>
-                    <a:blip r:embed="rId12" cstate="none"/>
+                    <a:blip r:embed="rId28" cstate="none"/>
                     <a:srcRect/>
                     <a:stretch>
                       <a:fillRect/>
@@ -7894,7 +9230,7 @@
                     </pic:cNvPicPr>
                   </pic:nvPicPr>
                   <pic:blipFill>
-                    <a:blip r:embed="rId13" cstate="none"/>
+                    <a:blip r:embed="rId29" cstate="none"/>
                     <a:srcRect/>
                     <a:stretch>
                       <a:fillRect/>
@@ -8791,7 +10127,7 @@
                     </pic:cNvPicPr>
                   </pic:nvPicPr>
                   <pic:blipFill>
-                    <a:blip r:embed="rId14" cstate="none"/>
+                    <a:blip r:embed="rId30" cstate="none"/>
                     <a:srcRect/>
                     <a:stretch>
                       <a:fillRect/>
@@ -9638,7 +10974,7 @@
         </w:rPr>
         <w:t xml:space="preserve">Kabul testi adımları: </w:t>
       </w:r>
-      <w:hyperlink w:history="1" r:id="rId2-wl-mv_vnuj5hxhch7g-">
+      <w:hyperlink w:history="1" r:id="rIdrzgvbtueflzmvozdd5vn1">
         <w:r>
           <w:rPr>
             <w:rStyle w:val="Hyperlink"/>

</xml_diff>